<commit_message>
feat: added more enhancements
</commit_message>
<xml_diff>
--- a/deliverables/output/RIMSS - Architecture Diagrams.docx
+++ b/deliverables/output/RIMSS - Architecture Diagrams.docx
@@ -178,7 +178,7 @@
           </w:tcPr>
           <w:p>
             <w:r>
-              <w:t xml:space="preserve">2026-10-15</w:t>
+              <w:t xml:space="preserve">2026-10-20</w:t>
             </w:r>
           </w:p>
         </w:tc>
@@ -188,7 +188,7 @@
           </w:tcPr>
           <w:p>
             <w:r>
-              <w:t xml:space="preserve">Senior Staff Engineer Candidate</w:t>
+              <w:t xml:space="preserve">Zibran Shaikh</w:t>
             </w:r>
           </w:p>
         </w:tc>
@@ -821,7 +821,7 @@
         <w:spacing w:after="120"/>
       </w:pPr>
       <w:r>
-        <w:t xml:space="preserve">Server-side pricing and idempotent order creation (ADR 0004).</w:t>
+        <w:t xml:space="preserve">Server-side pricing, sign-in at checkout, idempotent order creation and stock reservation (ADR 0004, 0010, 0011).</w:t>
       </w:r>
     </w:p>
     <w:p>

</xml_diff>